<commit_message>
research-program: Refresh verified research dossier exports and readiness evidence
<!-- workflow-source:local_request -->
</commit_message>
<xml_diff>
--- a/research-program/artifacts/dossiers/docx/00-INDEX.docx
+++ b/research-program/artifacts/dossiers/docx/00-INDEX.docx
@@ -858,7 +858,7 @@
                 <w:i w:val="0"/>
                 <w:sz w:val="22"/>
               </w:rPr>
-              <w:t>CLI, Streamlit, Excel/PPTX</w:t>
+              <w:t>CLI, Streamlit, Browser/stlite (unverified), Excel/PPTX</w:t>
             </w:r>
           </w:p>
         </w:tc>
@@ -909,7 +909,7 @@
                 <w:i w:val="0"/>
                 <w:sz w:val="22"/>
               </w:rPr>
-              <w:t>No run-contract/v1; Scenario.sleeves unwired</w:t>
+              <w:t>No run-contract/v1; Scenario.sleeves unwired; README regime caveats stale</w:t>
             </w:r>
           </w:p>
         </w:tc>
@@ -1342,7 +1342,25 @@
                 <w:i w:val="0"/>
                 <w:sz w:val="22"/>
               </w:rPr>
-              <w:t>HTTP API, Browser portal, CLI</w:t>
+              <w:t>HTTP API, Browser portal (</w:t>
+            </w:r>
+            <w:r>
+              <w:rPr>
+                <w:rFonts w:ascii="Consolas" w:hAnsi="Consolas"/>
+                <w:b w:val="0"/>
+                <w:i w:val="0"/>
+                <w:sz w:val="20"/>
+              </w:rPr>
+              <w:t>/portal/draft/new</w:t>
+            </w:r>
+            <w:r>
+              <w:rPr>
+                <w:rFonts w:ascii="Arial" w:hAnsi="Arial"/>
+                <w:b w:val="0"/>
+                <w:i w:val="0"/>
+                <w:sz w:val="22"/>
+              </w:rPr>
+              <w:t>), CLI</w:t>
             </w:r>
           </w:p>
         </w:tc>
@@ -1359,7 +1377,7 @@
                 <w:i w:val="0"/>
                 <w:sz w:val="22"/>
               </w:rPr>
-              <w:t>Yes</w:t>
+              <w:t>Yes (alpha)</w:t>
             </w:r>
           </w:p>
         </w:tc>
@@ -1393,7 +1411,7 @@
                 <w:i w:val="0"/>
                 <w:sz w:val="22"/>
               </w:rPr>
-              <w:t>No run-contract emitter; ERP write-back missing</w:t>
+              <w:t>No run-contract emitter; ERP write-back; security-model REST docs unwired</w:t>
             </w:r>
           </w:p>
         </w:tc>

</xml_diff>